<commit_message>
modificado por mi rama
</commit_message>
<xml_diff>
--- a/archivo ejemplo.docx
+++ b/archivo ejemplo.docx
@@ -4,41 +4,10 @@
   <w:body>
     <w:p>
       <w:r>
-        <w:t>Este es un archivo inicial versión 1.0</w:t>
+        <w:t>elimine el contenido por la rama 1</w:t>
       </w:r>
     </w:p>
-    <w:p/>
     <w:p>
-      <w:r>
-        <w:t>Cambio del archivo ver 2.0</w:t>
-      </w:r>
-    </w:p>
-    <w:p/>
-    <w:p>
-      <w:r>
-        <w:t>Insertando 1</w:t>
-      </w:r>
-      <w:r>
-        <w:t>,1</w:t>
-      </w:r>
-      <w:r>
-        <w:t>,1</w:t>
-      </w:r>
-      <w:r>
-        <w:t xml:space="preserve"> probado 1</w:t>
-      </w:r>
-    </w:p>
-    <w:p/>
-    <w:p>
-      <w:r>
-        <w:t>Insertando 2</w:t>
-      </w:r>
-      <w:r>
-        <w:t>,2</w:t>
-      </w:r>
-      <w:r>
-        <w:t>,2,2,2,2</w:t>
-      </w:r>
       <w:bookmarkStart w:id="0" w:name="_GoBack"/>
       <w:bookmarkEnd w:id="0"/>
     </w:p>

</xml_diff>

<commit_message>
contenido de la rama1
</commit_message>
<xml_diff>
--- a/archivo ejemplo.docx
+++ b/archivo ejemplo.docx
@@ -4,13 +4,37 @@
   <w:body>
     <w:p>
       <w:r>
-        <w:t>elimine el contenido por la rama 1</w:t>
+        <w:t>Este es un archivo inicial versión 1.0</w:t>
+      </w:r>
+    </w:p>
+    <w:p/>
+    <w:p>
+      <w:r>
+        <w:t>Cambio del archivo ver 2.0</w:t>
+      </w:r>
+    </w:p>
+    <w:p/>
+    <w:p>
+      <w:r>
+        <w:t>Insertando 1,1,1 probado 1</w:t>
+      </w:r>
+    </w:p>
+    <w:p/>
+    <w:p>
+      <w:r>
+        <w:t>Insertando 2,2,2,2,2,2</w:t>
       </w:r>
     </w:p>
     <w:p>
       <w:bookmarkStart w:id="0" w:name="_GoBack"/>
       <w:bookmarkEnd w:id="0"/>
     </w:p>
+    <w:p>
+      <w:r>
+        <w:t>elimine el contenido por la rama 1</w:t>
+      </w:r>
+    </w:p>
+    <w:p/>
     <w:sectPr>
       <w:pgSz w:w="12240" w:h="15840"/>
       <w:pgMar w:top="1417" w:right="1701" w:bottom="1417" w:left="1701" w:header="708" w:footer="708" w:gutter="0"/>

</xml_diff>

<commit_message>
Realizacion de cambiuo en rama1
</commit_message>
<xml_diff>
--- a/archivo ejemplo.docx
+++ b/archivo ejemplo.docx
@@ -25,13 +25,26 @@
         <w:t>Insertando 2,2,2,2,2,2</w:t>
       </w:r>
     </w:p>
+    <w:p/>
     <w:p>
+      <w:pPr>
+        <w:rPr>
+          <w:b/>
+        </w:rPr>
+      </w:pPr>
       <w:bookmarkStart w:id="0" w:name="_GoBack"/>
-      <w:bookmarkEnd w:id="0"/>
+      <w:r>
+        <w:rPr>
+          <w:b/>
+          <w:highlight w:val="yellow"/>
+        </w:rPr>
+        <w:t>Rama1</w:t>
+      </w:r>
     </w:p>
+    <w:bookmarkEnd w:id="0"/>
     <w:p>
       <w:r>
-        <w:t>elimine el contenido por la rama 1</w:t>
+        <w:t>Este contenido se realizo por la rama1 que es parte del ejemplo</w:t>
       </w:r>
     </w:p>
     <w:p/>

</xml_diff>